<commit_message>
lead(5R3): hoan tat blocker lane C — PLI_M10 width_policy content (path legacy list truyen spec vao _maybe_widen_table) + regen + rebaseline census/policies/fixture; D9 detector duyet bang can bang + bat <w:tbl attr>
</commit_message>
<xml_diff>
--- a/app/templates/PLI_M10.docx
+++ b/app/templates/PLI_M10.docx
@@ -26,23 +26,23 @@
         </w:tblBorders>
       </w:tblPr>
       <w:tblGrid>
-        <w:gridCol w:w="720"/>
-        <w:gridCol w:w="720"/>
-        <w:gridCol w:w="720"/>
-        <w:gridCol w:w="720"/>
-        <w:gridCol w:w="720"/>
-        <w:gridCol w:w="720"/>
-        <w:gridCol w:w="720"/>
-        <w:gridCol w:w="720"/>
-        <w:gridCol w:w="720"/>
-        <w:gridCol w:w="720"/>
-        <w:gridCol w:w="720"/>
-        <w:gridCol w:w="720"/>
+        <w:gridCol w:w="567"/>
+        <w:gridCol w:w="567"/>
+        <w:gridCol w:w="628"/>
+        <w:gridCol w:w="567"/>
+        <w:gridCol w:w="567"/>
+        <w:gridCol w:w="567"/>
+        <w:gridCol w:w="567"/>
+        <w:gridCol w:w="893"/>
+        <w:gridCol w:w="937"/>
+        <w:gridCol w:w="1646"/>
+        <w:gridCol w:w="567"/>
+        <w:gridCol w:w="567"/>
       </w:tblGrid>
       <w:tr>
         <w:tc>
           <w:tcPr>
-            <w:tcW w:type="dxa" w:w="720"/>
+            <w:tcW w:type="dxa" w:w="567"/>
           </w:tcPr>
           <w:p>
             <w:r>
@@ -55,7 +55,7 @@
         </w:tc>
         <w:tc>
           <w:tcPr>
-            <w:tcW w:type="dxa" w:w="720"/>
+            <w:tcW w:type="dxa" w:w="567"/>
           </w:tcPr>
           <w:p>
             <w:r>
@@ -68,7 +68,7 @@
         </w:tc>
         <w:tc>
           <w:tcPr>
-            <w:tcW w:type="dxa" w:w="720"/>
+            <w:tcW w:type="dxa" w:w="628"/>
           </w:tcPr>
           <w:p>
             <w:r>
@@ -81,7 +81,7 @@
         </w:tc>
         <w:tc>
           <w:tcPr>
-            <w:tcW w:type="dxa" w:w="720"/>
+            <w:tcW w:type="dxa" w:w="567"/>
           </w:tcPr>
           <w:p>
             <w:r>
@@ -94,7 +94,7 @@
         </w:tc>
         <w:tc>
           <w:tcPr>
-            <w:tcW w:type="dxa" w:w="720"/>
+            <w:tcW w:type="dxa" w:w="567"/>
           </w:tcPr>
           <w:p>
             <w:r>
@@ -107,7 +107,7 @@
         </w:tc>
         <w:tc>
           <w:tcPr>
-            <w:tcW w:type="dxa" w:w="720"/>
+            <w:tcW w:type="dxa" w:w="567"/>
           </w:tcPr>
           <w:p>
             <w:r>
@@ -120,7 +120,7 @@
         </w:tc>
         <w:tc>
           <w:tcPr>
-            <w:tcW w:type="dxa" w:w="720"/>
+            <w:tcW w:type="dxa" w:w="567"/>
           </w:tcPr>
           <w:p>
             <w:r>
@@ -133,7 +133,7 @@
         </w:tc>
         <w:tc>
           <w:tcPr>
-            <w:tcW w:type="dxa" w:w="720"/>
+            <w:tcW w:type="dxa" w:w="893"/>
           </w:tcPr>
           <w:p>
             <w:r>
@@ -146,7 +146,7 @@
         </w:tc>
         <w:tc>
           <w:tcPr>
-            <w:tcW w:type="dxa" w:w="720"/>
+            <w:tcW w:type="dxa" w:w="937"/>
           </w:tcPr>
           <w:p>
             <w:r>
@@ -159,7 +159,7 @@
         </w:tc>
         <w:tc>
           <w:tcPr>
-            <w:tcW w:type="dxa" w:w="720"/>
+            <w:tcW w:type="dxa" w:w="1646"/>
           </w:tcPr>
           <w:p>
             <w:r>
@@ -172,7 +172,7 @@
         </w:tc>
         <w:tc>
           <w:tcPr>
-            <w:tcW w:type="dxa" w:w="720"/>
+            <w:tcW w:type="dxa" w:w="567"/>
           </w:tcPr>
           <w:p>
             <w:r>
@@ -185,7 +185,7 @@
         </w:tc>
         <w:tc>
           <w:tcPr>
-            <w:tcW w:type="dxa" w:w="720"/>
+            <w:tcW w:type="dxa" w:w="567"/>
           </w:tcPr>
           <w:p>
             <w:r>
@@ -200,73 +200,73 @@
       <w:tr>
         <w:tc>
           <w:tcPr>
-            <w:tcW w:type="dxa" w:w="720"/>
-          </w:tcPr>
-          <w:p/>
-        </w:tc>
-        <w:tc>
-          <w:tcPr>
-            <w:tcW w:type="dxa" w:w="720"/>
-          </w:tcPr>
-          <w:p/>
-        </w:tc>
-        <w:tc>
-          <w:tcPr>
-            <w:tcW w:type="dxa" w:w="720"/>
-          </w:tcPr>
-          <w:p/>
-        </w:tc>
-        <w:tc>
-          <w:tcPr>
-            <w:tcW w:type="dxa" w:w="720"/>
-          </w:tcPr>
-          <w:p/>
-        </w:tc>
-        <w:tc>
-          <w:tcPr>
-            <w:tcW w:type="dxa" w:w="720"/>
-          </w:tcPr>
-          <w:p/>
-        </w:tc>
-        <w:tc>
-          <w:tcPr>
-            <w:tcW w:type="dxa" w:w="720"/>
-          </w:tcPr>
-          <w:p/>
-        </w:tc>
-        <w:tc>
-          <w:tcPr>
-            <w:tcW w:type="dxa" w:w="720"/>
-          </w:tcPr>
-          <w:p/>
-        </w:tc>
-        <w:tc>
-          <w:tcPr>
-            <w:tcW w:type="dxa" w:w="720"/>
-          </w:tcPr>
-          <w:p/>
-        </w:tc>
-        <w:tc>
-          <w:tcPr>
-            <w:tcW w:type="dxa" w:w="720"/>
-          </w:tcPr>
-          <w:p/>
-        </w:tc>
-        <w:tc>
-          <w:tcPr>
-            <w:tcW w:type="dxa" w:w="720"/>
-          </w:tcPr>
-          <w:p/>
-        </w:tc>
-        <w:tc>
-          <w:tcPr>
-            <w:tcW w:type="dxa" w:w="720"/>
-          </w:tcPr>
-          <w:p/>
-        </w:tc>
-        <w:tc>
-          <w:tcPr>
-            <w:tcW w:type="dxa" w:w="720"/>
+            <w:tcW w:type="dxa" w:w="567"/>
+          </w:tcPr>
+          <w:p/>
+        </w:tc>
+        <w:tc>
+          <w:tcPr>
+            <w:tcW w:type="dxa" w:w="567"/>
+          </w:tcPr>
+          <w:p/>
+        </w:tc>
+        <w:tc>
+          <w:tcPr>
+            <w:tcW w:type="dxa" w:w="628"/>
+          </w:tcPr>
+          <w:p/>
+        </w:tc>
+        <w:tc>
+          <w:tcPr>
+            <w:tcW w:type="dxa" w:w="567"/>
+          </w:tcPr>
+          <w:p/>
+        </w:tc>
+        <w:tc>
+          <w:tcPr>
+            <w:tcW w:type="dxa" w:w="567"/>
+          </w:tcPr>
+          <w:p/>
+        </w:tc>
+        <w:tc>
+          <w:tcPr>
+            <w:tcW w:type="dxa" w:w="567"/>
+          </w:tcPr>
+          <w:p/>
+        </w:tc>
+        <w:tc>
+          <w:tcPr>
+            <w:tcW w:type="dxa" w:w="567"/>
+          </w:tcPr>
+          <w:p/>
+        </w:tc>
+        <w:tc>
+          <w:tcPr>
+            <w:tcW w:type="dxa" w:w="893"/>
+          </w:tcPr>
+          <w:p/>
+        </w:tc>
+        <w:tc>
+          <w:tcPr>
+            <w:tcW w:type="dxa" w:w="937"/>
+          </w:tcPr>
+          <w:p/>
+        </w:tc>
+        <w:tc>
+          <w:tcPr>
+            <w:tcW w:type="dxa" w:w="1646"/>
+          </w:tcPr>
+          <w:p/>
+        </w:tc>
+        <w:tc>
+          <w:tcPr>
+            <w:tcW w:type="dxa" w:w="567"/>
+          </w:tcPr>
+          <w:p/>
+        </w:tc>
+        <w:tc>
+          <w:tcPr>
+            <w:tcW w:type="dxa" w:w="567"/>
           </w:tcPr>
           <w:p/>
         </w:tc>
@@ -274,73 +274,73 @@
       <w:tr>
         <w:tc>
           <w:tcPr>
-            <w:tcW w:type="dxa" w:w="720"/>
-          </w:tcPr>
-          <w:p/>
-        </w:tc>
-        <w:tc>
-          <w:tcPr>
-            <w:tcW w:type="dxa" w:w="720"/>
-          </w:tcPr>
-          <w:p/>
-        </w:tc>
-        <w:tc>
-          <w:tcPr>
-            <w:tcW w:type="dxa" w:w="720"/>
-          </w:tcPr>
-          <w:p/>
-        </w:tc>
-        <w:tc>
-          <w:tcPr>
-            <w:tcW w:type="dxa" w:w="720"/>
-          </w:tcPr>
-          <w:p/>
-        </w:tc>
-        <w:tc>
-          <w:tcPr>
-            <w:tcW w:type="dxa" w:w="720"/>
-          </w:tcPr>
-          <w:p/>
-        </w:tc>
-        <w:tc>
-          <w:tcPr>
-            <w:tcW w:type="dxa" w:w="720"/>
-          </w:tcPr>
-          <w:p/>
-        </w:tc>
-        <w:tc>
-          <w:tcPr>
-            <w:tcW w:type="dxa" w:w="720"/>
-          </w:tcPr>
-          <w:p/>
-        </w:tc>
-        <w:tc>
-          <w:tcPr>
-            <w:tcW w:type="dxa" w:w="720"/>
-          </w:tcPr>
-          <w:p/>
-        </w:tc>
-        <w:tc>
-          <w:tcPr>
-            <w:tcW w:type="dxa" w:w="720"/>
-          </w:tcPr>
-          <w:p/>
-        </w:tc>
-        <w:tc>
-          <w:tcPr>
-            <w:tcW w:type="dxa" w:w="720"/>
-          </w:tcPr>
-          <w:p/>
-        </w:tc>
-        <w:tc>
-          <w:tcPr>
-            <w:tcW w:type="dxa" w:w="720"/>
-          </w:tcPr>
-          <w:p/>
-        </w:tc>
-        <w:tc>
-          <w:tcPr>
-            <w:tcW w:type="dxa" w:w="720"/>
+            <w:tcW w:type="dxa" w:w="567"/>
+          </w:tcPr>
+          <w:p/>
+        </w:tc>
+        <w:tc>
+          <w:tcPr>
+            <w:tcW w:type="dxa" w:w="567"/>
+          </w:tcPr>
+          <w:p/>
+        </w:tc>
+        <w:tc>
+          <w:tcPr>
+            <w:tcW w:type="dxa" w:w="628"/>
+          </w:tcPr>
+          <w:p/>
+        </w:tc>
+        <w:tc>
+          <w:tcPr>
+            <w:tcW w:type="dxa" w:w="567"/>
+          </w:tcPr>
+          <w:p/>
+        </w:tc>
+        <w:tc>
+          <w:tcPr>
+            <w:tcW w:type="dxa" w:w="567"/>
+          </w:tcPr>
+          <w:p/>
+        </w:tc>
+        <w:tc>
+          <w:tcPr>
+            <w:tcW w:type="dxa" w:w="567"/>
+          </w:tcPr>
+          <w:p/>
+        </w:tc>
+        <w:tc>
+          <w:tcPr>
+            <w:tcW w:type="dxa" w:w="567"/>
+          </w:tcPr>
+          <w:p/>
+        </w:tc>
+        <w:tc>
+          <w:tcPr>
+            <w:tcW w:type="dxa" w:w="893"/>
+          </w:tcPr>
+          <w:p/>
+        </w:tc>
+        <w:tc>
+          <w:tcPr>
+            <w:tcW w:type="dxa" w:w="937"/>
+          </w:tcPr>
+          <w:p/>
+        </w:tc>
+        <w:tc>
+          <w:tcPr>
+            <w:tcW w:type="dxa" w:w="1646"/>
+          </w:tcPr>
+          <w:p/>
+        </w:tc>
+        <w:tc>
+          <w:tcPr>
+            <w:tcW w:type="dxa" w:w="567"/>
+          </w:tcPr>
+          <w:p/>
+        </w:tc>
+        <w:tc>
+          <w:tcPr>
+            <w:tcW w:type="dxa" w:w="567"/>
           </w:tcPr>
           <w:p/>
         </w:tc>
@@ -348,73 +348,73 @@
       <w:tr>
         <w:tc>
           <w:tcPr>
-            <w:tcW w:type="dxa" w:w="720"/>
-          </w:tcPr>
-          <w:p/>
-        </w:tc>
-        <w:tc>
-          <w:tcPr>
-            <w:tcW w:type="dxa" w:w="720"/>
-          </w:tcPr>
-          <w:p/>
-        </w:tc>
-        <w:tc>
-          <w:tcPr>
-            <w:tcW w:type="dxa" w:w="720"/>
-          </w:tcPr>
-          <w:p/>
-        </w:tc>
-        <w:tc>
-          <w:tcPr>
-            <w:tcW w:type="dxa" w:w="720"/>
-          </w:tcPr>
-          <w:p/>
-        </w:tc>
-        <w:tc>
-          <w:tcPr>
-            <w:tcW w:type="dxa" w:w="720"/>
-          </w:tcPr>
-          <w:p/>
-        </w:tc>
-        <w:tc>
-          <w:tcPr>
-            <w:tcW w:type="dxa" w:w="720"/>
-          </w:tcPr>
-          <w:p/>
-        </w:tc>
-        <w:tc>
-          <w:tcPr>
-            <w:tcW w:type="dxa" w:w="720"/>
-          </w:tcPr>
-          <w:p/>
-        </w:tc>
-        <w:tc>
-          <w:tcPr>
-            <w:tcW w:type="dxa" w:w="720"/>
-          </w:tcPr>
-          <w:p/>
-        </w:tc>
-        <w:tc>
-          <w:tcPr>
-            <w:tcW w:type="dxa" w:w="720"/>
-          </w:tcPr>
-          <w:p/>
-        </w:tc>
-        <w:tc>
-          <w:tcPr>
-            <w:tcW w:type="dxa" w:w="720"/>
-          </w:tcPr>
-          <w:p/>
-        </w:tc>
-        <w:tc>
-          <w:tcPr>
-            <w:tcW w:type="dxa" w:w="720"/>
-          </w:tcPr>
-          <w:p/>
-        </w:tc>
-        <w:tc>
-          <w:tcPr>
-            <w:tcW w:type="dxa" w:w="720"/>
+            <w:tcW w:type="dxa" w:w="567"/>
+          </w:tcPr>
+          <w:p/>
+        </w:tc>
+        <w:tc>
+          <w:tcPr>
+            <w:tcW w:type="dxa" w:w="567"/>
+          </w:tcPr>
+          <w:p/>
+        </w:tc>
+        <w:tc>
+          <w:tcPr>
+            <w:tcW w:type="dxa" w:w="628"/>
+          </w:tcPr>
+          <w:p/>
+        </w:tc>
+        <w:tc>
+          <w:tcPr>
+            <w:tcW w:type="dxa" w:w="567"/>
+          </w:tcPr>
+          <w:p/>
+        </w:tc>
+        <w:tc>
+          <w:tcPr>
+            <w:tcW w:type="dxa" w:w="567"/>
+          </w:tcPr>
+          <w:p/>
+        </w:tc>
+        <w:tc>
+          <w:tcPr>
+            <w:tcW w:type="dxa" w:w="567"/>
+          </w:tcPr>
+          <w:p/>
+        </w:tc>
+        <w:tc>
+          <w:tcPr>
+            <w:tcW w:type="dxa" w:w="567"/>
+          </w:tcPr>
+          <w:p/>
+        </w:tc>
+        <w:tc>
+          <w:tcPr>
+            <w:tcW w:type="dxa" w:w="893"/>
+          </w:tcPr>
+          <w:p/>
+        </w:tc>
+        <w:tc>
+          <w:tcPr>
+            <w:tcW w:type="dxa" w:w="937"/>
+          </w:tcPr>
+          <w:p/>
+        </w:tc>
+        <w:tc>
+          <w:tcPr>
+            <w:tcW w:type="dxa" w:w="1646"/>
+          </w:tcPr>
+          <w:p/>
+        </w:tc>
+        <w:tc>
+          <w:tcPr>
+            <w:tcW w:type="dxa" w:w="567"/>
+          </w:tcPr>
+          <w:p/>
+        </w:tc>
+        <w:tc>
+          <w:tcPr>
+            <w:tcW w:type="dxa" w:w="567"/>
           </w:tcPr>
           <w:p/>
         </w:tc>
@@ -422,73 +422,73 @@
       <w:tr>
         <w:tc>
           <w:tcPr>
-            <w:tcW w:type="dxa" w:w="720"/>
-          </w:tcPr>
-          <w:p/>
-        </w:tc>
-        <w:tc>
-          <w:tcPr>
-            <w:tcW w:type="dxa" w:w="720"/>
-          </w:tcPr>
-          <w:p/>
-        </w:tc>
-        <w:tc>
-          <w:tcPr>
-            <w:tcW w:type="dxa" w:w="720"/>
-          </w:tcPr>
-          <w:p/>
-        </w:tc>
-        <w:tc>
-          <w:tcPr>
-            <w:tcW w:type="dxa" w:w="720"/>
-          </w:tcPr>
-          <w:p/>
-        </w:tc>
-        <w:tc>
-          <w:tcPr>
-            <w:tcW w:type="dxa" w:w="720"/>
-          </w:tcPr>
-          <w:p/>
-        </w:tc>
-        <w:tc>
-          <w:tcPr>
-            <w:tcW w:type="dxa" w:w="720"/>
-          </w:tcPr>
-          <w:p/>
-        </w:tc>
-        <w:tc>
-          <w:tcPr>
-            <w:tcW w:type="dxa" w:w="720"/>
-          </w:tcPr>
-          <w:p/>
-        </w:tc>
-        <w:tc>
-          <w:tcPr>
-            <w:tcW w:type="dxa" w:w="720"/>
-          </w:tcPr>
-          <w:p/>
-        </w:tc>
-        <w:tc>
-          <w:tcPr>
-            <w:tcW w:type="dxa" w:w="720"/>
-          </w:tcPr>
-          <w:p/>
-        </w:tc>
-        <w:tc>
-          <w:tcPr>
-            <w:tcW w:type="dxa" w:w="720"/>
-          </w:tcPr>
-          <w:p/>
-        </w:tc>
-        <w:tc>
-          <w:tcPr>
-            <w:tcW w:type="dxa" w:w="720"/>
-          </w:tcPr>
-          <w:p/>
-        </w:tc>
-        <w:tc>
-          <w:tcPr>
-            <w:tcW w:type="dxa" w:w="720"/>
+            <w:tcW w:type="dxa" w:w="567"/>
+          </w:tcPr>
+          <w:p/>
+        </w:tc>
+        <w:tc>
+          <w:tcPr>
+            <w:tcW w:type="dxa" w:w="567"/>
+          </w:tcPr>
+          <w:p/>
+        </w:tc>
+        <w:tc>
+          <w:tcPr>
+            <w:tcW w:type="dxa" w:w="628"/>
+          </w:tcPr>
+          <w:p/>
+        </w:tc>
+        <w:tc>
+          <w:tcPr>
+            <w:tcW w:type="dxa" w:w="567"/>
+          </w:tcPr>
+          <w:p/>
+        </w:tc>
+        <w:tc>
+          <w:tcPr>
+            <w:tcW w:type="dxa" w:w="567"/>
+          </w:tcPr>
+          <w:p/>
+        </w:tc>
+        <w:tc>
+          <w:tcPr>
+            <w:tcW w:type="dxa" w:w="567"/>
+          </w:tcPr>
+          <w:p/>
+        </w:tc>
+        <w:tc>
+          <w:tcPr>
+            <w:tcW w:type="dxa" w:w="567"/>
+          </w:tcPr>
+          <w:p/>
+        </w:tc>
+        <w:tc>
+          <w:tcPr>
+            <w:tcW w:type="dxa" w:w="893"/>
+          </w:tcPr>
+          <w:p/>
+        </w:tc>
+        <w:tc>
+          <w:tcPr>
+            <w:tcW w:type="dxa" w:w="937"/>
+          </w:tcPr>
+          <w:p/>
+        </w:tc>
+        <w:tc>
+          <w:tcPr>
+            <w:tcW w:type="dxa" w:w="1646"/>
+          </w:tcPr>
+          <w:p/>
+        </w:tc>
+        <w:tc>
+          <w:tcPr>
+            <w:tcW w:type="dxa" w:w="567"/>
+          </w:tcPr>
+          <w:p/>
+        </w:tc>
+        <w:tc>
+          <w:tcPr>
+            <w:tcW w:type="dxa" w:w="567"/>
           </w:tcPr>
           <w:p/>
         </w:tc>
@@ -496,7 +496,7 @@
       <w:tr>
         <w:tc>
           <w:tcPr>
-            <w:tcW w:type="dxa" w:w="720"/>
+            <w:tcW w:type="dxa" w:w="567"/>
           </w:tcPr>
           <w:p>
             <w:r>
@@ -506,7 +506,7 @@
         </w:tc>
         <w:tc>
           <w:tcPr>
-            <w:tcW w:type="dxa" w:w="720"/>
+            <w:tcW w:type="dxa" w:w="567"/>
           </w:tcPr>
           <w:p>
             <w:r>
@@ -516,7 +516,7 @@
         </w:tc>
         <w:tc>
           <w:tcPr>
-            <w:tcW w:type="dxa" w:w="720"/>
+            <w:tcW w:type="dxa" w:w="628"/>
           </w:tcPr>
           <w:p>
             <w:r>
@@ -526,7 +526,7 @@
         </w:tc>
         <w:tc>
           <w:tcPr>
-            <w:tcW w:type="dxa" w:w="720"/>
+            <w:tcW w:type="dxa" w:w="567"/>
           </w:tcPr>
           <w:p>
             <w:r>
@@ -536,7 +536,7 @@
         </w:tc>
         <w:tc>
           <w:tcPr>
-            <w:tcW w:type="dxa" w:w="720"/>
+            <w:tcW w:type="dxa" w:w="567"/>
           </w:tcPr>
           <w:p>
             <w:r>
@@ -546,7 +546,7 @@
         </w:tc>
         <w:tc>
           <w:tcPr>
-            <w:tcW w:type="dxa" w:w="720"/>
+            <w:tcW w:type="dxa" w:w="567"/>
           </w:tcPr>
           <w:p>
             <w:r>
@@ -556,7 +556,7 @@
         </w:tc>
         <w:tc>
           <w:tcPr>
-            <w:tcW w:type="dxa" w:w="720"/>
+            <w:tcW w:type="dxa" w:w="567"/>
           </w:tcPr>
           <w:p>
             <w:r>
@@ -566,7 +566,7 @@
         </w:tc>
         <w:tc>
           <w:tcPr>
-            <w:tcW w:type="dxa" w:w="720"/>
+            <w:tcW w:type="dxa" w:w="893"/>
           </w:tcPr>
           <w:p>
             <w:r>
@@ -576,7 +576,7 @@
         </w:tc>
         <w:tc>
           <w:tcPr>
-            <w:tcW w:type="dxa" w:w="720"/>
+            <w:tcW w:type="dxa" w:w="937"/>
           </w:tcPr>
           <w:p>
             <w:r>
@@ -586,7 +586,7 @@
         </w:tc>
         <w:tc>
           <w:tcPr>
-            <w:tcW w:type="dxa" w:w="720"/>
+            <w:tcW w:type="dxa" w:w="1646"/>
           </w:tcPr>
           <w:p>
             <w:r>
@@ -596,7 +596,7 @@
         </w:tc>
         <w:tc>
           <w:tcPr>
-            <w:tcW w:type="dxa" w:w="720"/>
+            <w:tcW w:type="dxa" w:w="567"/>
           </w:tcPr>
           <w:p>
             <w:r>
@@ -606,7 +606,7 @@
         </w:tc>
         <w:tc>
           <w:tcPr>
-            <w:tcW w:type="dxa" w:w="720"/>
+            <w:tcW w:type="dxa" w:w="567"/>
           </w:tcPr>
           <w:p>
             <w:r>

</xml_diff>

<commit_message>
wave3: merge Lane E (paginate E1-E4) + regen ×2 (M10 floors theo fixture ty_le mới, M70 sig-table 600/240, M72 zip-noise) + pin sync r3b1 ANCHOR 90 (C3 chèn Mẫu số 12) + W3 DNTN/DHDN 2→1 (E3 thu trang)
</commit_message>
<xml_diff>
--- a/app/templates/PLI_M10.docx
+++ b/app/templates/PLI_M10.docx
@@ -34,29 +34,29 @@
         </w:tblBorders>
       </w:tblPr>
       <w:tblGrid>
-        <w:gridCol w:w="645"/>
-        <w:gridCol w:w="811"/>
-        <w:gridCol w:w="920"/>
-        <w:gridCol w:w="615"/>
-        <w:gridCol w:w="1089"/>
-        <w:gridCol w:w="860"/>
-        <w:gridCol w:w="664"/>
-        <w:gridCol w:w="811"/>
-        <w:gridCol w:w="747"/>
-        <w:gridCol w:w="747"/>
-        <w:gridCol w:w="982"/>
-        <w:gridCol w:w="747"/>
-        <w:gridCol w:w="747"/>
-        <w:gridCol w:w="982"/>
-        <w:gridCol w:w="747"/>
-        <w:gridCol w:w="792"/>
-        <w:gridCol w:w="747"/>
-        <w:gridCol w:w="747"/>
+        <w:gridCol w:w="656"/>
+        <w:gridCol w:w="835"/>
+        <w:gridCol w:w="953"/>
+        <w:gridCol w:w="624"/>
+        <w:gridCol w:w="1134"/>
+        <w:gridCol w:w="888"/>
+        <w:gridCol w:w="677"/>
+        <w:gridCol w:w="835"/>
+        <w:gridCol w:w="766"/>
+        <w:gridCol w:w="766"/>
+        <w:gridCol w:w="783"/>
+        <w:gridCol w:w="766"/>
+        <w:gridCol w:w="766"/>
+        <w:gridCol w:w="840"/>
+        <w:gridCol w:w="766"/>
+        <w:gridCol w:w="815"/>
+        <w:gridCol w:w="765"/>
+        <w:gridCol w:w="765"/>
       </w:tblGrid>
       <w:tr>
         <w:tc>
           <w:tcPr>
-            <w:tcW w:type="dxa" w:w="645"/>
+            <w:tcW w:type="dxa" w:w="656"/>
             <w:vMerge w:val="restart"/>
           </w:tcPr>
           <w:p>
@@ -70,7 +70,7 @@
         </w:tc>
         <w:tc>
           <w:tcPr>
-            <w:tcW w:type="dxa" w:w="811"/>
+            <w:tcW w:type="dxa" w:w="835"/>
             <w:vMerge w:val="restart"/>
           </w:tcPr>
           <w:p>
@@ -84,7 +84,7 @@
         </w:tc>
         <w:tc>
           <w:tcPr>
-            <w:tcW w:type="dxa" w:w="920"/>
+            <w:tcW w:type="dxa" w:w="953"/>
             <w:vMerge w:val="restart"/>
           </w:tcPr>
           <w:p>
@@ -98,7 +98,7 @@
         </w:tc>
         <w:tc>
           <w:tcPr>
-            <w:tcW w:type="dxa" w:w="615"/>
+            <w:tcW w:type="dxa" w:w="624"/>
             <w:vMerge w:val="restart"/>
           </w:tcPr>
           <w:p>
@@ -112,7 +112,7 @@
         </w:tc>
         <w:tc>
           <w:tcPr>
-            <w:tcW w:type="dxa" w:w="1089"/>
+            <w:tcW w:type="dxa" w:w="1134"/>
             <w:vMerge w:val="restart"/>
           </w:tcPr>
           <w:p>
@@ -126,7 +126,7 @@
         </w:tc>
         <w:tc>
           <w:tcPr>
-            <w:tcW w:type="dxa" w:w="860"/>
+            <w:tcW w:type="dxa" w:w="888"/>
             <w:vMerge w:val="restart"/>
           </w:tcPr>
           <w:p>
@@ -140,7 +140,7 @@
         </w:tc>
         <w:tc>
           <w:tcPr>
-            <w:tcW w:type="dxa" w:w="664"/>
+            <w:tcW w:type="dxa" w:w="677"/>
             <w:vMerge w:val="restart"/>
           </w:tcPr>
           <w:p>
@@ -154,7 +154,7 @@
         </w:tc>
         <w:tc>
           <w:tcPr>
-            <w:tcW w:type="dxa" w:w="811"/>
+            <w:tcW w:type="dxa" w:w="835"/>
             <w:vMerge w:val="restart"/>
           </w:tcPr>
           <w:p>
@@ -168,7 +168,7 @@
         </w:tc>
         <w:tc>
           <w:tcPr>
-            <w:tcW w:type="dxa" w:w="7238"/>
+            <w:tcW w:type="dxa" w:w="7033"/>
             <w:gridSpan w:val="9"/>
           </w:tcPr>
           <w:p>
@@ -182,7 +182,7 @@
         </w:tc>
         <w:tc>
           <w:tcPr>
-            <w:tcW w:type="dxa" w:w="747"/>
+            <w:tcW w:type="dxa" w:w="765"/>
             <w:vMerge w:val="restart"/>
           </w:tcPr>
           <w:p>
@@ -198,63 +198,63 @@
       <w:tr>
         <w:tc>
           <w:tcPr>
-            <w:tcW w:type="dxa" w:w="645"/>
+            <w:tcW w:type="dxa" w:w="656"/>
             <w:vMerge/>
           </w:tcPr>
           <w:p/>
         </w:tc>
         <w:tc>
           <w:tcPr>
-            <w:tcW w:type="dxa" w:w="811"/>
+            <w:tcW w:type="dxa" w:w="835"/>
             <w:vMerge/>
           </w:tcPr>
           <w:p/>
         </w:tc>
         <w:tc>
           <w:tcPr>
-            <w:tcW w:type="dxa" w:w="920"/>
+            <w:tcW w:type="dxa" w:w="953"/>
             <w:vMerge/>
           </w:tcPr>
           <w:p/>
         </w:tc>
         <w:tc>
           <w:tcPr>
-            <w:tcW w:type="dxa" w:w="615"/>
+            <w:tcW w:type="dxa" w:w="624"/>
             <w:vMerge/>
           </w:tcPr>
           <w:p/>
         </w:tc>
         <w:tc>
           <w:tcPr>
-            <w:tcW w:type="dxa" w:w="1089"/>
+            <w:tcW w:type="dxa" w:w="1134"/>
             <w:vMerge/>
           </w:tcPr>
           <w:p/>
         </w:tc>
         <w:tc>
           <w:tcPr>
-            <w:tcW w:type="dxa" w:w="860"/>
+            <w:tcW w:type="dxa" w:w="888"/>
             <w:vMerge/>
           </w:tcPr>
           <w:p/>
         </w:tc>
         <w:tc>
           <w:tcPr>
-            <w:tcW w:type="dxa" w:w="664"/>
+            <w:tcW w:type="dxa" w:w="677"/>
             <w:vMerge/>
           </w:tcPr>
           <w:p/>
         </w:tc>
         <w:tc>
           <w:tcPr>
-            <w:tcW w:type="dxa" w:w="811"/>
+            <w:tcW w:type="dxa" w:w="835"/>
             <w:vMerge/>
           </w:tcPr>
           <w:p/>
         </w:tc>
         <w:tc>
           <w:tcPr>
-            <w:tcW w:type="dxa" w:w="2476"/>
+            <w:tcW w:type="dxa" w:w="2315"/>
             <w:gridSpan w:val="3"/>
           </w:tcPr>
           <w:p>
@@ -268,7 +268,7 @@
         </w:tc>
         <w:tc>
           <w:tcPr>
-            <w:tcW w:type="dxa" w:w="2476"/>
+            <w:tcW w:type="dxa" w:w="2372"/>
             <w:gridSpan w:val="3"/>
           </w:tcPr>
           <w:p>
@@ -282,7 +282,7 @@
         </w:tc>
         <w:tc>
           <w:tcPr>
-            <w:tcW w:type="dxa" w:w="747"/>
+            <w:tcW w:type="dxa" w:w="766"/>
             <w:vMerge w:val="restart"/>
           </w:tcPr>
           <w:p>
@@ -296,7 +296,7 @@
         </w:tc>
         <w:tc>
           <w:tcPr>
-            <w:tcW w:type="dxa" w:w="792"/>
+            <w:tcW w:type="dxa" w:w="815"/>
             <w:vMerge w:val="restart"/>
           </w:tcPr>
           <w:p>
@@ -310,7 +310,7 @@
         </w:tc>
         <w:tc>
           <w:tcPr>
-            <w:tcW w:type="dxa" w:w="747"/>
+            <w:tcW w:type="dxa" w:w="765"/>
             <w:vMerge w:val="restart"/>
           </w:tcPr>
           <w:p>
@@ -324,7 +324,7 @@
         </w:tc>
         <w:tc>
           <w:tcPr>
-            <w:tcW w:type="dxa" w:w="747"/>
+            <w:tcW w:type="dxa" w:w="765"/>
             <w:vMerge/>
           </w:tcPr>
           <w:p/>
@@ -333,63 +333,63 @@
       <w:tr>
         <w:tc>
           <w:tcPr>
-            <w:tcW w:type="dxa" w:w="645"/>
+            <w:tcW w:type="dxa" w:w="656"/>
             <w:vMerge/>
           </w:tcPr>
           <w:p/>
         </w:tc>
         <w:tc>
           <w:tcPr>
-            <w:tcW w:type="dxa" w:w="811"/>
+            <w:tcW w:type="dxa" w:w="835"/>
             <w:vMerge/>
           </w:tcPr>
           <w:p/>
         </w:tc>
         <w:tc>
           <w:tcPr>
-            <w:tcW w:type="dxa" w:w="920"/>
+            <w:tcW w:type="dxa" w:w="953"/>
             <w:vMerge/>
           </w:tcPr>
           <w:p/>
         </w:tc>
         <w:tc>
           <w:tcPr>
-            <w:tcW w:type="dxa" w:w="615"/>
+            <w:tcW w:type="dxa" w:w="624"/>
             <w:vMerge/>
           </w:tcPr>
           <w:p/>
         </w:tc>
         <w:tc>
           <w:tcPr>
-            <w:tcW w:type="dxa" w:w="1089"/>
+            <w:tcW w:type="dxa" w:w="1134"/>
             <w:vMerge/>
           </w:tcPr>
           <w:p/>
         </w:tc>
         <w:tc>
           <w:tcPr>
-            <w:tcW w:type="dxa" w:w="860"/>
+            <w:tcW w:type="dxa" w:w="888"/>
             <w:vMerge/>
           </w:tcPr>
           <w:p/>
         </w:tc>
         <w:tc>
           <w:tcPr>
-            <w:tcW w:type="dxa" w:w="664"/>
+            <w:tcW w:type="dxa" w:w="677"/>
             <w:vMerge/>
           </w:tcPr>
           <w:p/>
         </w:tc>
         <w:tc>
           <w:tcPr>
-            <w:tcW w:type="dxa" w:w="811"/>
+            <w:tcW w:type="dxa" w:w="835"/>
             <w:vMerge/>
           </w:tcPr>
           <w:p/>
         </w:tc>
         <w:tc>
           <w:tcPr>
-            <w:tcW w:type="dxa" w:w="747"/>
+            <w:tcW w:type="dxa" w:w="766"/>
           </w:tcPr>
           <w:p>
             <w:r>
@@ -402,7 +402,7 @@
         </w:tc>
         <w:tc>
           <w:tcPr>
-            <w:tcW w:type="dxa" w:w="747"/>
+            <w:tcW w:type="dxa" w:w="766"/>
           </w:tcPr>
           <w:p>
             <w:r>
@@ -415,7 +415,7 @@
         </w:tc>
         <w:tc>
           <w:tcPr>
-            <w:tcW w:type="dxa" w:w="982"/>
+            <w:tcW w:type="dxa" w:w="783"/>
           </w:tcPr>
           <w:p>
             <w:r>
@@ -428,7 +428,7 @@
         </w:tc>
         <w:tc>
           <w:tcPr>
-            <w:tcW w:type="dxa" w:w="747"/>
+            <w:tcW w:type="dxa" w:w="766"/>
           </w:tcPr>
           <w:p>
             <w:r>
@@ -441,7 +441,7 @@
         </w:tc>
         <w:tc>
           <w:tcPr>
-            <w:tcW w:type="dxa" w:w="747"/>
+            <w:tcW w:type="dxa" w:w="766"/>
           </w:tcPr>
           <w:p>
             <w:r>
@@ -454,7 +454,7 @@
         </w:tc>
         <w:tc>
           <w:tcPr>
-            <w:tcW w:type="dxa" w:w="982"/>
+            <w:tcW w:type="dxa" w:w="840"/>
           </w:tcPr>
           <w:p>
             <w:r>
@@ -467,28 +467,28 @@
         </w:tc>
         <w:tc>
           <w:tcPr>
-            <w:tcW w:type="dxa" w:w="747"/>
+            <w:tcW w:type="dxa" w:w="766"/>
             <w:vMerge/>
           </w:tcPr>
           <w:p/>
         </w:tc>
         <w:tc>
           <w:tcPr>
-            <w:tcW w:type="dxa" w:w="792"/>
+            <w:tcW w:type="dxa" w:w="815"/>
             <w:vMerge/>
           </w:tcPr>
           <w:p/>
         </w:tc>
         <w:tc>
           <w:tcPr>
-            <w:tcW w:type="dxa" w:w="747"/>
+            <w:tcW w:type="dxa" w:w="765"/>
             <w:vMerge/>
           </w:tcPr>
           <w:p/>
         </w:tc>
         <w:tc>
           <w:tcPr>
-            <w:tcW w:type="dxa" w:w="747"/>
+            <w:tcW w:type="dxa" w:w="765"/>
             <w:vMerge/>
           </w:tcPr>
           <w:p/>
@@ -497,7 +497,7 @@
       <w:tr>
         <w:tc>
           <w:tcPr>
-            <w:tcW w:type="dxa" w:w="645"/>
+            <w:tcW w:type="dxa" w:w="656"/>
           </w:tcPr>
           <w:p>
             <w:r>
@@ -510,7 +510,7 @@
         </w:tc>
         <w:tc>
           <w:tcPr>
-            <w:tcW w:type="dxa" w:w="811"/>
+            <w:tcW w:type="dxa" w:w="835"/>
           </w:tcPr>
           <w:p>
             <w:r>
@@ -523,7 +523,7 @@
         </w:tc>
         <w:tc>
           <w:tcPr>
-            <w:tcW w:type="dxa" w:w="920"/>
+            <w:tcW w:type="dxa" w:w="953"/>
           </w:tcPr>
           <w:p>
             <w:r>
@@ -536,7 +536,7 @@
         </w:tc>
         <w:tc>
           <w:tcPr>
-            <w:tcW w:type="dxa" w:w="615"/>
+            <w:tcW w:type="dxa" w:w="624"/>
           </w:tcPr>
           <w:p>
             <w:r>
@@ -549,7 +549,7 @@
         </w:tc>
         <w:tc>
           <w:tcPr>
-            <w:tcW w:type="dxa" w:w="1089"/>
+            <w:tcW w:type="dxa" w:w="1134"/>
           </w:tcPr>
           <w:p>
             <w:r>
@@ -562,7 +562,7 @@
         </w:tc>
         <w:tc>
           <w:tcPr>
-            <w:tcW w:type="dxa" w:w="860"/>
+            <w:tcW w:type="dxa" w:w="888"/>
           </w:tcPr>
           <w:p>
             <w:r>
@@ -575,7 +575,7 @@
         </w:tc>
         <w:tc>
           <w:tcPr>
-            <w:tcW w:type="dxa" w:w="664"/>
+            <w:tcW w:type="dxa" w:w="677"/>
           </w:tcPr>
           <w:p>
             <w:r>
@@ -588,7 +588,7 @@
         </w:tc>
         <w:tc>
           <w:tcPr>
-            <w:tcW w:type="dxa" w:w="811"/>
+            <w:tcW w:type="dxa" w:w="835"/>
           </w:tcPr>
           <w:p>
             <w:r>
@@ -601,7 +601,7 @@
         </w:tc>
         <w:tc>
           <w:tcPr>
-            <w:tcW w:type="dxa" w:w="747"/>
+            <w:tcW w:type="dxa" w:w="766"/>
           </w:tcPr>
           <w:p>
             <w:r>
@@ -614,7 +614,7 @@
         </w:tc>
         <w:tc>
           <w:tcPr>
-            <w:tcW w:type="dxa" w:w="747"/>
+            <w:tcW w:type="dxa" w:w="766"/>
           </w:tcPr>
           <w:p>
             <w:r>
@@ -627,7 +627,7 @@
         </w:tc>
         <w:tc>
           <w:tcPr>
-            <w:tcW w:type="dxa" w:w="982"/>
+            <w:tcW w:type="dxa" w:w="783"/>
           </w:tcPr>
           <w:p>
             <w:r>
@@ -640,7 +640,7 @@
         </w:tc>
         <w:tc>
           <w:tcPr>
-            <w:tcW w:type="dxa" w:w="747"/>
+            <w:tcW w:type="dxa" w:w="766"/>
           </w:tcPr>
           <w:p>
             <w:r>
@@ -653,7 +653,7 @@
         </w:tc>
         <w:tc>
           <w:tcPr>
-            <w:tcW w:type="dxa" w:w="747"/>
+            <w:tcW w:type="dxa" w:w="766"/>
           </w:tcPr>
           <w:p>
             <w:r>
@@ -666,7 +666,7 @@
         </w:tc>
         <w:tc>
           <w:tcPr>
-            <w:tcW w:type="dxa" w:w="982"/>
+            <w:tcW w:type="dxa" w:w="840"/>
           </w:tcPr>
           <w:p>
             <w:r>
@@ -679,7 +679,7 @@
         </w:tc>
         <w:tc>
           <w:tcPr>
-            <w:tcW w:type="dxa" w:w="747"/>
+            <w:tcW w:type="dxa" w:w="766"/>
           </w:tcPr>
           <w:p>
             <w:r>
@@ -692,7 +692,7 @@
         </w:tc>
         <w:tc>
           <w:tcPr>
-            <w:tcW w:type="dxa" w:w="792"/>
+            <w:tcW w:type="dxa" w:w="815"/>
           </w:tcPr>
           <w:p>
             <w:r>
@@ -705,7 +705,7 @@
         </w:tc>
         <w:tc>
           <w:tcPr>
-            <w:tcW w:type="dxa" w:w="747"/>
+            <w:tcW w:type="dxa" w:w="765"/>
           </w:tcPr>
           <w:p>
             <w:r>
@@ -718,7 +718,7 @@
         </w:tc>
         <w:tc>
           <w:tcPr>
-            <w:tcW w:type="dxa" w:w="747"/>
+            <w:tcW w:type="dxa" w:w="765"/>
           </w:tcPr>
           <w:p>
             <w:r>
@@ -733,109 +733,109 @@
       <w:tr>
         <w:tc>
           <w:tcPr>
-            <w:tcW w:type="dxa" w:w="645"/>
-          </w:tcPr>
-          <w:p/>
-        </w:tc>
-        <w:tc>
-          <w:tcPr>
-            <w:tcW w:type="dxa" w:w="811"/>
-          </w:tcPr>
-          <w:p/>
-        </w:tc>
-        <w:tc>
-          <w:tcPr>
-            <w:tcW w:type="dxa" w:w="920"/>
-          </w:tcPr>
-          <w:p/>
-        </w:tc>
-        <w:tc>
-          <w:tcPr>
-            <w:tcW w:type="dxa" w:w="615"/>
-          </w:tcPr>
-          <w:p/>
-        </w:tc>
-        <w:tc>
-          <w:tcPr>
-            <w:tcW w:type="dxa" w:w="1089"/>
-          </w:tcPr>
-          <w:p/>
-        </w:tc>
-        <w:tc>
-          <w:tcPr>
-            <w:tcW w:type="dxa" w:w="860"/>
-          </w:tcPr>
-          <w:p/>
-        </w:tc>
-        <w:tc>
-          <w:tcPr>
-            <w:tcW w:type="dxa" w:w="664"/>
-          </w:tcPr>
-          <w:p/>
-        </w:tc>
-        <w:tc>
-          <w:tcPr>
-            <w:tcW w:type="dxa" w:w="811"/>
-          </w:tcPr>
-          <w:p/>
-        </w:tc>
-        <w:tc>
-          <w:tcPr>
-            <w:tcW w:type="dxa" w:w="747"/>
-          </w:tcPr>
-          <w:p/>
-        </w:tc>
-        <w:tc>
-          <w:tcPr>
-            <w:tcW w:type="dxa" w:w="747"/>
-          </w:tcPr>
-          <w:p/>
-        </w:tc>
-        <w:tc>
-          <w:tcPr>
-            <w:tcW w:type="dxa" w:w="982"/>
-          </w:tcPr>
-          <w:p/>
-        </w:tc>
-        <w:tc>
-          <w:tcPr>
-            <w:tcW w:type="dxa" w:w="747"/>
-          </w:tcPr>
-          <w:p/>
-        </w:tc>
-        <w:tc>
-          <w:tcPr>
-            <w:tcW w:type="dxa" w:w="747"/>
-          </w:tcPr>
-          <w:p/>
-        </w:tc>
-        <w:tc>
-          <w:tcPr>
-            <w:tcW w:type="dxa" w:w="982"/>
-          </w:tcPr>
-          <w:p/>
-        </w:tc>
-        <w:tc>
-          <w:tcPr>
-            <w:tcW w:type="dxa" w:w="747"/>
-          </w:tcPr>
-          <w:p/>
-        </w:tc>
-        <w:tc>
-          <w:tcPr>
-            <w:tcW w:type="dxa" w:w="792"/>
-          </w:tcPr>
-          <w:p/>
-        </w:tc>
-        <w:tc>
-          <w:tcPr>
-            <w:tcW w:type="dxa" w:w="747"/>
-          </w:tcPr>
-          <w:p/>
-        </w:tc>
-        <w:tc>
-          <w:tcPr>
-            <w:tcW w:type="dxa" w:w="747"/>
+            <w:tcW w:type="dxa" w:w="656"/>
+          </w:tcPr>
+          <w:p/>
+        </w:tc>
+        <w:tc>
+          <w:tcPr>
+            <w:tcW w:type="dxa" w:w="835"/>
+          </w:tcPr>
+          <w:p/>
+        </w:tc>
+        <w:tc>
+          <w:tcPr>
+            <w:tcW w:type="dxa" w:w="953"/>
+          </w:tcPr>
+          <w:p/>
+        </w:tc>
+        <w:tc>
+          <w:tcPr>
+            <w:tcW w:type="dxa" w:w="624"/>
+          </w:tcPr>
+          <w:p/>
+        </w:tc>
+        <w:tc>
+          <w:tcPr>
+            <w:tcW w:type="dxa" w:w="1134"/>
+          </w:tcPr>
+          <w:p/>
+        </w:tc>
+        <w:tc>
+          <w:tcPr>
+            <w:tcW w:type="dxa" w:w="888"/>
+          </w:tcPr>
+          <w:p/>
+        </w:tc>
+        <w:tc>
+          <w:tcPr>
+            <w:tcW w:type="dxa" w:w="677"/>
+          </w:tcPr>
+          <w:p/>
+        </w:tc>
+        <w:tc>
+          <w:tcPr>
+            <w:tcW w:type="dxa" w:w="835"/>
+          </w:tcPr>
+          <w:p/>
+        </w:tc>
+        <w:tc>
+          <w:tcPr>
+            <w:tcW w:type="dxa" w:w="766"/>
+          </w:tcPr>
+          <w:p/>
+        </w:tc>
+        <w:tc>
+          <w:tcPr>
+            <w:tcW w:type="dxa" w:w="766"/>
+          </w:tcPr>
+          <w:p/>
+        </w:tc>
+        <w:tc>
+          <w:tcPr>
+            <w:tcW w:type="dxa" w:w="783"/>
+          </w:tcPr>
+          <w:p/>
+        </w:tc>
+        <w:tc>
+          <w:tcPr>
+            <w:tcW w:type="dxa" w:w="766"/>
+          </w:tcPr>
+          <w:p/>
+        </w:tc>
+        <w:tc>
+          <w:tcPr>
+            <w:tcW w:type="dxa" w:w="766"/>
+          </w:tcPr>
+          <w:p/>
+        </w:tc>
+        <w:tc>
+          <w:tcPr>
+            <w:tcW w:type="dxa" w:w="840"/>
+          </w:tcPr>
+          <w:p/>
+        </w:tc>
+        <w:tc>
+          <w:tcPr>
+            <w:tcW w:type="dxa" w:w="766"/>
+          </w:tcPr>
+          <w:p/>
+        </w:tc>
+        <w:tc>
+          <w:tcPr>
+            <w:tcW w:type="dxa" w:w="815"/>
+          </w:tcPr>
+          <w:p/>
+        </w:tc>
+        <w:tc>
+          <w:tcPr>
+            <w:tcW w:type="dxa" w:w="765"/>
+          </w:tcPr>
+          <w:p/>
+        </w:tc>
+        <w:tc>
+          <w:tcPr>
+            <w:tcW w:type="dxa" w:w="765"/>
           </w:tcPr>
           <w:p/>
         </w:tc>
@@ -843,109 +843,109 @@
       <w:tr>
         <w:tc>
           <w:tcPr>
-            <w:tcW w:type="dxa" w:w="645"/>
-          </w:tcPr>
-          <w:p/>
-        </w:tc>
-        <w:tc>
-          <w:tcPr>
-            <w:tcW w:type="dxa" w:w="811"/>
-          </w:tcPr>
-          <w:p/>
-        </w:tc>
-        <w:tc>
-          <w:tcPr>
-            <w:tcW w:type="dxa" w:w="920"/>
-          </w:tcPr>
-          <w:p/>
-        </w:tc>
-        <w:tc>
-          <w:tcPr>
-            <w:tcW w:type="dxa" w:w="615"/>
-          </w:tcPr>
-          <w:p/>
-        </w:tc>
-        <w:tc>
-          <w:tcPr>
-            <w:tcW w:type="dxa" w:w="1089"/>
-          </w:tcPr>
-          <w:p/>
-        </w:tc>
-        <w:tc>
-          <w:tcPr>
-            <w:tcW w:type="dxa" w:w="860"/>
-          </w:tcPr>
-          <w:p/>
-        </w:tc>
-        <w:tc>
-          <w:tcPr>
-            <w:tcW w:type="dxa" w:w="664"/>
-          </w:tcPr>
-          <w:p/>
-        </w:tc>
-        <w:tc>
-          <w:tcPr>
-            <w:tcW w:type="dxa" w:w="811"/>
-          </w:tcPr>
-          <w:p/>
-        </w:tc>
-        <w:tc>
-          <w:tcPr>
-            <w:tcW w:type="dxa" w:w="747"/>
-          </w:tcPr>
-          <w:p/>
-        </w:tc>
-        <w:tc>
-          <w:tcPr>
-            <w:tcW w:type="dxa" w:w="747"/>
-          </w:tcPr>
-          <w:p/>
-        </w:tc>
-        <w:tc>
-          <w:tcPr>
-            <w:tcW w:type="dxa" w:w="982"/>
-          </w:tcPr>
-          <w:p/>
-        </w:tc>
-        <w:tc>
-          <w:tcPr>
-            <w:tcW w:type="dxa" w:w="747"/>
-          </w:tcPr>
-          <w:p/>
-        </w:tc>
-        <w:tc>
-          <w:tcPr>
-            <w:tcW w:type="dxa" w:w="747"/>
-          </w:tcPr>
-          <w:p/>
-        </w:tc>
-        <w:tc>
-          <w:tcPr>
-            <w:tcW w:type="dxa" w:w="982"/>
-          </w:tcPr>
-          <w:p/>
-        </w:tc>
-        <w:tc>
-          <w:tcPr>
-            <w:tcW w:type="dxa" w:w="747"/>
-          </w:tcPr>
-          <w:p/>
-        </w:tc>
-        <w:tc>
-          <w:tcPr>
-            <w:tcW w:type="dxa" w:w="792"/>
-          </w:tcPr>
-          <w:p/>
-        </w:tc>
-        <w:tc>
-          <w:tcPr>
-            <w:tcW w:type="dxa" w:w="747"/>
-          </w:tcPr>
-          <w:p/>
-        </w:tc>
-        <w:tc>
-          <w:tcPr>
-            <w:tcW w:type="dxa" w:w="747"/>
+            <w:tcW w:type="dxa" w:w="656"/>
+          </w:tcPr>
+          <w:p/>
+        </w:tc>
+        <w:tc>
+          <w:tcPr>
+            <w:tcW w:type="dxa" w:w="835"/>
+          </w:tcPr>
+          <w:p/>
+        </w:tc>
+        <w:tc>
+          <w:tcPr>
+            <w:tcW w:type="dxa" w:w="953"/>
+          </w:tcPr>
+          <w:p/>
+        </w:tc>
+        <w:tc>
+          <w:tcPr>
+            <w:tcW w:type="dxa" w:w="624"/>
+          </w:tcPr>
+          <w:p/>
+        </w:tc>
+        <w:tc>
+          <w:tcPr>
+            <w:tcW w:type="dxa" w:w="1134"/>
+          </w:tcPr>
+          <w:p/>
+        </w:tc>
+        <w:tc>
+          <w:tcPr>
+            <w:tcW w:type="dxa" w:w="888"/>
+          </w:tcPr>
+          <w:p/>
+        </w:tc>
+        <w:tc>
+          <w:tcPr>
+            <w:tcW w:type="dxa" w:w="677"/>
+          </w:tcPr>
+          <w:p/>
+        </w:tc>
+        <w:tc>
+          <w:tcPr>
+            <w:tcW w:type="dxa" w:w="835"/>
+          </w:tcPr>
+          <w:p/>
+        </w:tc>
+        <w:tc>
+          <w:tcPr>
+            <w:tcW w:type="dxa" w:w="766"/>
+          </w:tcPr>
+          <w:p/>
+        </w:tc>
+        <w:tc>
+          <w:tcPr>
+            <w:tcW w:type="dxa" w:w="766"/>
+          </w:tcPr>
+          <w:p/>
+        </w:tc>
+        <w:tc>
+          <w:tcPr>
+            <w:tcW w:type="dxa" w:w="783"/>
+          </w:tcPr>
+          <w:p/>
+        </w:tc>
+        <w:tc>
+          <w:tcPr>
+            <w:tcW w:type="dxa" w:w="766"/>
+          </w:tcPr>
+          <w:p/>
+        </w:tc>
+        <w:tc>
+          <w:tcPr>
+            <w:tcW w:type="dxa" w:w="766"/>
+          </w:tcPr>
+          <w:p/>
+        </w:tc>
+        <w:tc>
+          <w:tcPr>
+            <w:tcW w:type="dxa" w:w="840"/>
+          </w:tcPr>
+          <w:p/>
+        </w:tc>
+        <w:tc>
+          <w:tcPr>
+            <w:tcW w:type="dxa" w:w="766"/>
+          </w:tcPr>
+          <w:p/>
+        </w:tc>
+        <w:tc>
+          <w:tcPr>
+            <w:tcW w:type="dxa" w:w="815"/>
+          </w:tcPr>
+          <w:p/>
+        </w:tc>
+        <w:tc>
+          <w:tcPr>
+            <w:tcW w:type="dxa" w:w="765"/>
+          </w:tcPr>
+          <w:p/>
+        </w:tc>
+        <w:tc>
+          <w:tcPr>
+            <w:tcW w:type="dxa" w:w="765"/>
           </w:tcPr>
           <w:p/>
         </w:tc>
@@ -953,109 +953,109 @@
       <w:tr>
         <w:tc>
           <w:tcPr>
-            <w:tcW w:type="dxa" w:w="645"/>
-          </w:tcPr>
-          <w:p/>
-        </w:tc>
-        <w:tc>
-          <w:tcPr>
-            <w:tcW w:type="dxa" w:w="811"/>
-          </w:tcPr>
-          <w:p/>
-        </w:tc>
-        <w:tc>
-          <w:tcPr>
-            <w:tcW w:type="dxa" w:w="920"/>
-          </w:tcPr>
-          <w:p/>
-        </w:tc>
-        <w:tc>
-          <w:tcPr>
-            <w:tcW w:type="dxa" w:w="615"/>
-          </w:tcPr>
-          <w:p/>
-        </w:tc>
-        <w:tc>
-          <w:tcPr>
-            <w:tcW w:type="dxa" w:w="1089"/>
-          </w:tcPr>
-          <w:p/>
-        </w:tc>
-        <w:tc>
-          <w:tcPr>
-            <w:tcW w:type="dxa" w:w="860"/>
-          </w:tcPr>
-          <w:p/>
-        </w:tc>
-        <w:tc>
-          <w:tcPr>
-            <w:tcW w:type="dxa" w:w="664"/>
-          </w:tcPr>
-          <w:p/>
-        </w:tc>
-        <w:tc>
-          <w:tcPr>
-            <w:tcW w:type="dxa" w:w="811"/>
-          </w:tcPr>
-          <w:p/>
-        </w:tc>
-        <w:tc>
-          <w:tcPr>
-            <w:tcW w:type="dxa" w:w="747"/>
-          </w:tcPr>
-          <w:p/>
-        </w:tc>
-        <w:tc>
-          <w:tcPr>
-            <w:tcW w:type="dxa" w:w="747"/>
-          </w:tcPr>
-          <w:p/>
-        </w:tc>
-        <w:tc>
-          <w:tcPr>
-            <w:tcW w:type="dxa" w:w="982"/>
-          </w:tcPr>
-          <w:p/>
-        </w:tc>
-        <w:tc>
-          <w:tcPr>
-            <w:tcW w:type="dxa" w:w="747"/>
-          </w:tcPr>
-          <w:p/>
-        </w:tc>
-        <w:tc>
-          <w:tcPr>
-            <w:tcW w:type="dxa" w:w="747"/>
-          </w:tcPr>
-          <w:p/>
-        </w:tc>
-        <w:tc>
-          <w:tcPr>
-            <w:tcW w:type="dxa" w:w="982"/>
-          </w:tcPr>
-          <w:p/>
-        </w:tc>
-        <w:tc>
-          <w:tcPr>
-            <w:tcW w:type="dxa" w:w="747"/>
-          </w:tcPr>
-          <w:p/>
-        </w:tc>
-        <w:tc>
-          <w:tcPr>
-            <w:tcW w:type="dxa" w:w="792"/>
-          </w:tcPr>
-          <w:p/>
-        </w:tc>
-        <w:tc>
-          <w:tcPr>
-            <w:tcW w:type="dxa" w:w="747"/>
-          </w:tcPr>
-          <w:p/>
-        </w:tc>
-        <w:tc>
-          <w:tcPr>
-            <w:tcW w:type="dxa" w:w="747"/>
+            <w:tcW w:type="dxa" w:w="656"/>
+          </w:tcPr>
+          <w:p/>
+        </w:tc>
+        <w:tc>
+          <w:tcPr>
+            <w:tcW w:type="dxa" w:w="835"/>
+          </w:tcPr>
+          <w:p/>
+        </w:tc>
+        <w:tc>
+          <w:tcPr>
+            <w:tcW w:type="dxa" w:w="953"/>
+          </w:tcPr>
+          <w:p/>
+        </w:tc>
+        <w:tc>
+          <w:tcPr>
+            <w:tcW w:type="dxa" w:w="624"/>
+          </w:tcPr>
+          <w:p/>
+        </w:tc>
+        <w:tc>
+          <w:tcPr>
+            <w:tcW w:type="dxa" w:w="1134"/>
+          </w:tcPr>
+          <w:p/>
+        </w:tc>
+        <w:tc>
+          <w:tcPr>
+            <w:tcW w:type="dxa" w:w="888"/>
+          </w:tcPr>
+          <w:p/>
+        </w:tc>
+        <w:tc>
+          <w:tcPr>
+            <w:tcW w:type="dxa" w:w="677"/>
+          </w:tcPr>
+          <w:p/>
+        </w:tc>
+        <w:tc>
+          <w:tcPr>
+            <w:tcW w:type="dxa" w:w="835"/>
+          </w:tcPr>
+          <w:p/>
+        </w:tc>
+        <w:tc>
+          <w:tcPr>
+            <w:tcW w:type="dxa" w:w="766"/>
+          </w:tcPr>
+          <w:p/>
+        </w:tc>
+        <w:tc>
+          <w:tcPr>
+            <w:tcW w:type="dxa" w:w="766"/>
+          </w:tcPr>
+          <w:p/>
+        </w:tc>
+        <w:tc>
+          <w:tcPr>
+            <w:tcW w:type="dxa" w:w="783"/>
+          </w:tcPr>
+          <w:p/>
+        </w:tc>
+        <w:tc>
+          <w:tcPr>
+            <w:tcW w:type="dxa" w:w="766"/>
+          </w:tcPr>
+          <w:p/>
+        </w:tc>
+        <w:tc>
+          <w:tcPr>
+            <w:tcW w:type="dxa" w:w="766"/>
+          </w:tcPr>
+          <w:p/>
+        </w:tc>
+        <w:tc>
+          <w:tcPr>
+            <w:tcW w:type="dxa" w:w="840"/>
+          </w:tcPr>
+          <w:p/>
+        </w:tc>
+        <w:tc>
+          <w:tcPr>
+            <w:tcW w:type="dxa" w:w="766"/>
+          </w:tcPr>
+          <w:p/>
+        </w:tc>
+        <w:tc>
+          <w:tcPr>
+            <w:tcW w:type="dxa" w:w="815"/>
+          </w:tcPr>
+          <w:p/>
+        </w:tc>
+        <w:tc>
+          <w:tcPr>
+            <w:tcW w:type="dxa" w:w="765"/>
+          </w:tcPr>
+          <w:p/>
+        </w:tc>
+        <w:tc>
+          <w:tcPr>
+            <w:tcW w:type="dxa" w:w="765"/>
           </w:tcPr>
           <w:p/>
         </w:tc>
@@ -1063,109 +1063,109 @@
       <w:tr>
         <w:tc>
           <w:tcPr>
-            <w:tcW w:type="dxa" w:w="645"/>
-          </w:tcPr>
-          <w:p/>
-        </w:tc>
-        <w:tc>
-          <w:tcPr>
-            <w:tcW w:type="dxa" w:w="811"/>
-          </w:tcPr>
-          <w:p/>
-        </w:tc>
-        <w:tc>
-          <w:tcPr>
-            <w:tcW w:type="dxa" w:w="920"/>
-          </w:tcPr>
-          <w:p/>
-        </w:tc>
-        <w:tc>
-          <w:tcPr>
-            <w:tcW w:type="dxa" w:w="615"/>
-          </w:tcPr>
-          <w:p/>
-        </w:tc>
-        <w:tc>
-          <w:tcPr>
-            <w:tcW w:type="dxa" w:w="1089"/>
-          </w:tcPr>
-          <w:p/>
-        </w:tc>
-        <w:tc>
-          <w:tcPr>
-            <w:tcW w:type="dxa" w:w="860"/>
-          </w:tcPr>
-          <w:p/>
-        </w:tc>
-        <w:tc>
-          <w:tcPr>
-            <w:tcW w:type="dxa" w:w="664"/>
-          </w:tcPr>
-          <w:p/>
-        </w:tc>
-        <w:tc>
-          <w:tcPr>
-            <w:tcW w:type="dxa" w:w="811"/>
-          </w:tcPr>
-          <w:p/>
-        </w:tc>
-        <w:tc>
-          <w:tcPr>
-            <w:tcW w:type="dxa" w:w="747"/>
-          </w:tcPr>
-          <w:p/>
-        </w:tc>
-        <w:tc>
-          <w:tcPr>
-            <w:tcW w:type="dxa" w:w="747"/>
-          </w:tcPr>
-          <w:p/>
-        </w:tc>
-        <w:tc>
-          <w:tcPr>
-            <w:tcW w:type="dxa" w:w="982"/>
-          </w:tcPr>
-          <w:p/>
-        </w:tc>
-        <w:tc>
-          <w:tcPr>
-            <w:tcW w:type="dxa" w:w="747"/>
-          </w:tcPr>
-          <w:p/>
-        </w:tc>
-        <w:tc>
-          <w:tcPr>
-            <w:tcW w:type="dxa" w:w="747"/>
-          </w:tcPr>
-          <w:p/>
-        </w:tc>
-        <w:tc>
-          <w:tcPr>
-            <w:tcW w:type="dxa" w:w="982"/>
-          </w:tcPr>
-          <w:p/>
-        </w:tc>
-        <w:tc>
-          <w:tcPr>
-            <w:tcW w:type="dxa" w:w="747"/>
-          </w:tcPr>
-          <w:p/>
-        </w:tc>
-        <w:tc>
-          <w:tcPr>
-            <w:tcW w:type="dxa" w:w="792"/>
-          </w:tcPr>
-          <w:p/>
-        </w:tc>
-        <w:tc>
-          <w:tcPr>
-            <w:tcW w:type="dxa" w:w="747"/>
-          </w:tcPr>
-          <w:p/>
-        </w:tc>
-        <w:tc>
-          <w:tcPr>
-            <w:tcW w:type="dxa" w:w="747"/>
+            <w:tcW w:type="dxa" w:w="656"/>
+          </w:tcPr>
+          <w:p/>
+        </w:tc>
+        <w:tc>
+          <w:tcPr>
+            <w:tcW w:type="dxa" w:w="835"/>
+          </w:tcPr>
+          <w:p/>
+        </w:tc>
+        <w:tc>
+          <w:tcPr>
+            <w:tcW w:type="dxa" w:w="953"/>
+          </w:tcPr>
+          <w:p/>
+        </w:tc>
+        <w:tc>
+          <w:tcPr>
+            <w:tcW w:type="dxa" w:w="624"/>
+          </w:tcPr>
+          <w:p/>
+        </w:tc>
+        <w:tc>
+          <w:tcPr>
+            <w:tcW w:type="dxa" w:w="1134"/>
+          </w:tcPr>
+          <w:p/>
+        </w:tc>
+        <w:tc>
+          <w:tcPr>
+            <w:tcW w:type="dxa" w:w="888"/>
+          </w:tcPr>
+          <w:p/>
+        </w:tc>
+        <w:tc>
+          <w:tcPr>
+            <w:tcW w:type="dxa" w:w="677"/>
+          </w:tcPr>
+          <w:p/>
+        </w:tc>
+        <w:tc>
+          <w:tcPr>
+            <w:tcW w:type="dxa" w:w="835"/>
+          </w:tcPr>
+          <w:p/>
+        </w:tc>
+        <w:tc>
+          <w:tcPr>
+            <w:tcW w:type="dxa" w:w="766"/>
+          </w:tcPr>
+          <w:p/>
+        </w:tc>
+        <w:tc>
+          <w:tcPr>
+            <w:tcW w:type="dxa" w:w="766"/>
+          </w:tcPr>
+          <w:p/>
+        </w:tc>
+        <w:tc>
+          <w:tcPr>
+            <w:tcW w:type="dxa" w:w="783"/>
+          </w:tcPr>
+          <w:p/>
+        </w:tc>
+        <w:tc>
+          <w:tcPr>
+            <w:tcW w:type="dxa" w:w="766"/>
+          </w:tcPr>
+          <w:p/>
+        </w:tc>
+        <w:tc>
+          <w:tcPr>
+            <w:tcW w:type="dxa" w:w="766"/>
+          </w:tcPr>
+          <w:p/>
+        </w:tc>
+        <w:tc>
+          <w:tcPr>
+            <w:tcW w:type="dxa" w:w="840"/>
+          </w:tcPr>
+          <w:p/>
+        </w:tc>
+        <w:tc>
+          <w:tcPr>
+            <w:tcW w:type="dxa" w:w="766"/>
+          </w:tcPr>
+          <w:p/>
+        </w:tc>
+        <w:tc>
+          <w:tcPr>
+            <w:tcW w:type="dxa" w:w="815"/>
+          </w:tcPr>
+          <w:p/>
+        </w:tc>
+        <w:tc>
+          <w:tcPr>
+            <w:tcW w:type="dxa" w:w="765"/>
+          </w:tcPr>
+          <w:p/>
+        </w:tc>
+        <w:tc>
+          <w:tcPr>
+            <w:tcW w:type="dxa" w:w="765"/>
           </w:tcPr>
           <w:p/>
         </w:tc>
@@ -1173,109 +1173,109 @@
       <w:tr>
         <w:tc>
           <w:tcPr>
-            <w:tcW w:type="dxa" w:w="645"/>
-          </w:tcPr>
-          <w:p/>
-        </w:tc>
-        <w:tc>
-          <w:tcPr>
-            <w:tcW w:type="dxa" w:w="811"/>
-          </w:tcPr>
-          <w:p/>
-        </w:tc>
-        <w:tc>
-          <w:tcPr>
-            <w:tcW w:type="dxa" w:w="920"/>
-          </w:tcPr>
-          <w:p/>
-        </w:tc>
-        <w:tc>
-          <w:tcPr>
-            <w:tcW w:type="dxa" w:w="615"/>
-          </w:tcPr>
-          <w:p/>
-        </w:tc>
-        <w:tc>
-          <w:tcPr>
-            <w:tcW w:type="dxa" w:w="1089"/>
-          </w:tcPr>
-          <w:p/>
-        </w:tc>
-        <w:tc>
-          <w:tcPr>
-            <w:tcW w:type="dxa" w:w="860"/>
-          </w:tcPr>
-          <w:p/>
-        </w:tc>
-        <w:tc>
-          <w:tcPr>
-            <w:tcW w:type="dxa" w:w="664"/>
-          </w:tcPr>
-          <w:p/>
-        </w:tc>
-        <w:tc>
-          <w:tcPr>
-            <w:tcW w:type="dxa" w:w="811"/>
-          </w:tcPr>
-          <w:p/>
-        </w:tc>
-        <w:tc>
-          <w:tcPr>
-            <w:tcW w:type="dxa" w:w="747"/>
-          </w:tcPr>
-          <w:p/>
-        </w:tc>
-        <w:tc>
-          <w:tcPr>
-            <w:tcW w:type="dxa" w:w="747"/>
-          </w:tcPr>
-          <w:p/>
-        </w:tc>
-        <w:tc>
-          <w:tcPr>
-            <w:tcW w:type="dxa" w:w="982"/>
-          </w:tcPr>
-          <w:p/>
-        </w:tc>
-        <w:tc>
-          <w:tcPr>
-            <w:tcW w:type="dxa" w:w="747"/>
-          </w:tcPr>
-          <w:p/>
-        </w:tc>
-        <w:tc>
-          <w:tcPr>
-            <w:tcW w:type="dxa" w:w="747"/>
-          </w:tcPr>
-          <w:p/>
-        </w:tc>
-        <w:tc>
-          <w:tcPr>
-            <w:tcW w:type="dxa" w:w="982"/>
-          </w:tcPr>
-          <w:p/>
-        </w:tc>
-        <w:tc>
-          <w:tcPr>
-            <w:tcW w:type="dxa" w:w="747"/>
-          </w:tcPr>
-          <w:p/>
-        </w:tc>
-        <w:tc>
-          <w:tcPr>
-            <w:tcW w:type="dxa" w:w="792"/>
-          </w:tcPr>
-          <w:p/>
-        </w:tc>
-        <w:tc>
-          <w:tcPr>
-            <w:tcW w:type="dxa" w:w="747"/>
-          </w:tcPr>
-          <w:p/>
-        </w:tc>
-        <w:tc>
-          <w:tcPr>
-            <w:tcW w:type="dxa" w:w="747"/>
+            <w:tcW w:type="dxa" w:w="656"/>
+          </w:tcPr>
+          <w:p/>
+        </w:tc>
+        <w:tc>
+          <w:tcPr>
+            <w:tcW w:type="dxa" w:w="835"/>
+          </w:tcPr>
+          <w:p/>
+        </w:tc>
+        <w:tc>
+          <w:tcPr>
+            <w:tcW w:type="dxa" w:w="953"/>
+          </w:tcPr>
+          <w:p/>
+        </w:tc>
+        <w:tc>
+          <w:tcPr>
+            <w:tcW w:type="dxa" w:w="624"/>
+          </w:tcPr>
+          <w:p/>
+        </w:tc>
+        <w:tc>
+          <w:tcPr>
+            <w:tcW w:type="dxa" w:w="1134"/>
+          </w:tcPr>
+          <w:p/>
+        </w:tc>
+        <w:tc>
+          <w:tcPr>
+            <w:tcW w:type="dxa" w:w="888"/>
+          </w:tcPr>
+          <w:p/>
+        </w:tc>
+        <w:tc>
+          <w:tcPr>
+            <w:tcW w:type="dxa" w:w="677"/>
+          </w:tcPr>
+          <w:p/>
+        </w:tc>
+        <w:tc>
+          <w:tcPr>
+            <w:tcW w:type="dxa" w:w="835"/>
+          </w:tcPr>
+          <w:p/>
+        </w:tc>
+        <w:tc>
+          <w:tcPr>
+            <w:tcW w:type="dxa" w:w="766"/>
+          </w:tcPr>
+          <w:p/>
+        </w:tc>
+        <w:tc>
+          <w:tcPr>
+            <w:tcW w:type="dxa" w:w="766"/>
+          </w:tcPr>
+          <w:p/>
+        </w:tc>
+        <w:tc>
+          <w:tcPr>
+            <w:tcW w:type="dxa" w:w="783"/>
+          </w:tcPr>
+          <w:p/>
+        </w:tc>
+        <w:tc>
+          <w:tcPr>
+            <w:tcW w:type="dxa" w:w="766"/>
+          </w:tcPr>
+          <w:p/>
+        </w:tc>
+        <w:tc>
+          <w:tcPr>
+            <w:tcW w:type="dxa" w:w="766"/>
+          </w:tcPr>
+          <w:p/>
+        </w:tc>
+        <w:tc>
+          <w:tcPr>
+            <w:tcW w:type="dxa" w:w="840"/>
+          </w:tcPr>
+          <w:p/>
+        </w:tc>
+        <w:tc>
+          <w:tcPr>
+            <w:tcW w:type="dxa" w:w="766"/>
+          </w:tcPr>
+          <w:p/>
+        </w:tc>
+        <w:tc>
+          <w:tcPr>
+            <w:tcW w:type="dxa" w:w="815"/>
+          </w:tcPr>
+          <w:p/>
+        </w:tc>
+        <w:tc>
+          <w:tcPr>
+            <w:tcW w:type="dxa" w:w="765"/>
+          </w:tcPr>
+          <w:p/>
+        </w:tc>
+        <w:tc>
+          <w:tcPr>
+            <w:tcW w:type="dxa" w:w="765"/>
           </w:tcPr>
           <w:p/>
         </w:tc>
@@ -1283,7 +1283,7 @@
       <w:tr>
         <w:tc>
           <w:tcPr>
-            <w:tcW w:type="dxa" w:w="645"/>
+            <w:tcW w:type="dxa" w:w="656"/>
           </w:tcPr>
           <w:p>
             <w:r>
@@ -1296,7 +1296,7 @@
         </w:tc>
         <w:tc>
           <w:tcPr>
-            <w:tcW w:type="dxa" w:w="811"/>
+            <w:tcW w:type="dxa" w:w="835"/>
           </w:tcPr>
           <w:p>
             <w:r>
@@ -1309,7 +1309,7 @@
         </w:tc>
         <w:tc>
           <w:tcPr>
-            <w:tcW w:type="dxa" w:w="920"/>
+            <w:tcW w:type="dxa" w:w="953"/>
           </w:tcPr>
           <w:p>
             <w:r>
@@ -1322,7 +1322,7 @@
         </w:tc>
         <w:tc>
           <w:tcPr>
-            <w:tcW w:type="dxa" w:w="615"/>
+            <w:tcW w:type="dxa" w:w="624"/>
           </w:tcPr>
           <w:p>
             <w:r>
@@ -1335,7 +1335,7 @@
         </w:tc>
         <w:tc>
           <w:tcPr>
-            <w:tcW w:type="dxa" w:w="1089"/>
+            <w:tcW w:type="dxa" w:w="1134"/>
           </w:tcPr>
           <w:p>
             <w:r>
@@ -1348,7 +1348,7 @@
         </w:tc>
         <w:tc>
           <w:tcPr>
-            <w:tcW w:type="dxa" w:w="860"/>
+            <w:tcW w:type="dxa" w:w="888"/>
           </w:tcPr>
           <w:p>
             <w:r>
@@ -1361,7 +1361,7 @@
         </w:tc>
         <w:tc>
           <w:tcPr>
-            <w:tcW w:type="dxa" w:w="664"/>
+            <w:tcW w:type="dxa" w:w="677"/>
           </w:tcPr>
           <w:p>
             <w:r>
@@ -1374,7 +1374,7 @@
         </w:tc>
         <w:tc>
           <w:tcPr>
-            <w:tcW w:type="dxa" w:w="811"/>
+            <w:tcW w:type="dxa" w:w="835"/>
           </w:tcPr>
           <w:p>
             <w:r>
@@ -1387,7 +1387,7 @@
         </w:tc>
         <w:tc>
           <w:tcPr>
-            <w:tcW w:type="dxa" w:w="747"/>
+            <w:tcW w:type="dxa" w:w="766"/>
           </w:tcPr>
           <w:p>
             <w:r>
@@ -1400,7 +1400,7 @@
         </w:tc>
         <w:tc>
           <w:tcPr>
-            <w:tcW w:type="dxa" w:w="747"/>
+            <w:tcW w:type="dxa" w:w="766"/>
           </w:tcPr>
           <w:p>
             <w:r>
@@ -1413,7 +1413,7 @@
         </w:tc>
         <w:tc>
           <w:tcPr>
-            <w:tcW w:type="dxa" w:w="982"/>
+            <w:tcW w:type="dxa" w:w="783"/>
           </w:tcPr>
           <w:p>
             <w:r>
@@ -1426,7 +1426,7 @@
         </w:tc>
         <w:tc>
           <w:tcPr>
-            <w:tcW w:type="dxa" w:w="747"/>
+            <w:tcW w:type="dxa" w:w="766"/>
           </w:tcPr>
           <w:p>
             <w:r>
@@ -1439,7 +1439,7 @@
         </w:tc>
         <w:tc>
           <w:tcPr>
-            <w:tcW w:type="dxa" w:w="747"/>
+            <w:tcW w:type="dxa" w:w="766"/>
           </w:tcPr>
           <w:p>
             <w:r>
@@ -1452,7 +1452,7 @@
         </w:tc>
         <w:tc>
           <w:tcPr>
-            <w:tcW w:type="dxa" w:w="982"/>
+            <w:tcW w:type="dxa" w:w="840"/>
           </w:tcPr>
           <w:p>
             <w:r>
@@ -1465,7 +1465,7 @@
         </w:tc>
         <w:tc>
           <w:tcPr>
-            <w:tcW w:type="dxa" w:w="747"/>
+            <w:tcW w:type="dxa" w:w="766"/>
           </w:tcPr>
           <w:p>
             <w:r>
@@ -1478,7 +1478,7 @@
         </w:tc>
         <w:tc>
           <w:tcPr>
-            <w:tcW w:type="dxa" w:w="792"/>
+            <w:tcW w:type="dxa" w:w="815"/>
           </w:tcPr>
           <w:p>
             <w:r>
@@ -1491,7 +1491,7 @@
         </w:tc>
         <w:tc>
           <w:tcPr>
-            <w:tcW w:type="dxa" w:w="747"/>
+            <w:tcW w:type="dxa" w:w="765"/>
           </w:tcPr>
           <w:p>
             <w:r>
@@ -1504,7 +1504,7 @@
         </w:tc>
         <w:tc>
           <w:tcPr>
-            <w:tcW w:type="dxa" w:w="747"/>
+            <w:tcW w:type="dxa" w:w="765"/>
           </w:tcPr>
           <w:p>
             <w:r>

</xml_diff>